<commit_message>
Ajout des frais d'étude de dossier (non remboursables)
- Frais d'étude de dossier de 50 $ (non remboursables) à l'admission
  des membres réguliers et associés (étudiants exemptés), distincts de
  la cotisation annuelle
- Ajouté à la page Adhésion, à la Politique d'adhésion (doc + page),
  au Guide d'adhésion, au Formulaire d'adhésion et à la FAQ (FR + EN)
- Word/PDF régénérés; ZIP public reconstruit

Co-Authored-By: Claude Opus 4.8 <noreply@anthropic.com>
</commit_message>
<xml_diff>
--- a/telechargements/word-en/3-Politique-adhesion-Membership-Policy.docx
+++ b/telechargements/word-en/3-Politique-adhesion-Membership-Policy.docx
@@ -528,6 +528,21 @@
           <w:b/>
           <w:bCs/>
         </w:rPr>
+        <w:t xml:space="preserve">Application review fee</w:t>
+      </w:r>
+      <w:r>
+        <w:t xml:space="preserve">: a non-refundable fee of $50 applies to the admission of regular and associate members, in addition to dues; student members are exempt.</w:t>
+      </w:r>
+    </w:p>
+    <w:p>
+      <w:pPr>
+        <w:spacing w:after="140"/>
+      </w:pPr>
+      <w:r>
+        <w:rPr>
+          <w:b/>
+          <w:bCs/>
+        </w:rPr>
         <w:t xml:space="preserve">Internship and practical experience</w:t>
       </w:r>
       <w:r>
@@ -591,7 +606,7 @@
         <w:spacing w:after="60"/>
       </w:pPr>
       <w:r>
-        <w:t xml:space="preserve">Payment of dues and confirmation of membership.</w:t>
+        <w:t xml:space="preserve">Payment of the non-refundable application review fee and the dues, then confirmation of membership.</w:t>
       </w:r>
     </w:p>
     <w:p>

</xml_diff>